<commit_message>
Refine field workflow and template-driven report generation
</commit_message>
<xml_diff>
--- a/template.docx
+++ b/template.docx
@@ -42,6 +42,79 @@
           <w:rFonts w:ascii="Times New Roman" w:hAnsi="Times New Roman"/>
           <w:noProof/>
         </w:rPr>
+        <w:drawing>
+          <wp:anchor distT="0" distB="0" distL="114300" distR="114300" simplePos="0" relativeHeight="251659264" behindDoc="0" locked="0" layoutInCell="1" allowOverlap="1" wp14:anchorId="709D2B00" wp14:editId="24F57AD6">
+            <wp:simplePos x="0" y="0"/>
+            <wp:positionH relativeFrom="margin">
+              <wp:align>center</wp:align>
+            </wp:positionH>
+            <wp:positionV relativeFrom="paragraph">
+              <wp:posOffset>346672</wp:posOffset>
+            </wp:positionV>
+            <wp:extent cx="3538800" cy="849600"/>
+            <wp:effectExtent l="0" t="0" r="5080" b="0"/>
+            <wp:wrapSquare wrapText="bothSides"/>
+            <wp:docPr id="1589633920" name="图片 1">
+              <a:extLst xmlns:a="http://schemas.openxmlformats.org/drawingml/2006/main">
+                <a:ext uri="{FF2B5EF4-FFF2-40B4-BE49-F238E27FC236}">
+                  <a16:creationId xmlns:a16="http://schemas.microsoft.com/office/drawing/2014/main" id="{EC6CEEB5-762F-ECAC-A0C5-0FC0351AB26E}"/>
+                </a:ext>
+              </a:extLst>
+            </wp:docPr>
+            <wp:cNvGraphicFramePr>
+              <a:graphicFrameLocks xmlns:a="http://schemas.openxmlformats.org/drawingml/2006/main" noChangeAspect="1"/>
+            </wp:cNvGraphicFramePr>
+            <a:graphic xmlns:a="http://schemas.openxmlformats.org/drawingml/2006/main">
+              <a:graphicData uri="http://schemas.openxmlformats.org/drawingml/2006/picture">
+                <pic:pic xmlns:pic="http://schemas.openxmlformats.org/drawingml/2006/picture">
+                  <pic:nvPicPr>
+                    <pic:cNvPr id="1589633920" name="图片 1">
+                      <a:extLst>
+                        <a:ext uri="{FF2B5EF4-FFF2-40B4-BE49-F238E27FC236}">
+                          <a16:creationId xmlns:a16="http://schemas.microsoft.com/office/drawing/2014/main" id="{EC6CEEB5-762F-ECAC-A0C5-0FC0351AB26E}"/>
+                        </a:ext>
+                      </a:extLst>
+                    </pic:cNvPr>
+                    <pic:cNvPicPr>
+                      <a:picLocks noChangeAspect="1" noChangeArrowheads="1"/>
+                    </pic:cNvPicPr>
+                  </pic:nvPicPr>
+                  <pic:blipFill>
+                    <a:blip r:embed="rId9" cstate="print">
+                      <a:extLst>
+                        <a:ext uri="{28A0092B-C50C-407E-A947-70E740481C1C}">
+                          <a14:useLocalDpi xmlns:a14="http://schemas.microsoft.com/office/drawing/2010/main" val="0"/>
+                        </a:ext>
+                      </a:extLst>
+                    </a:blip>
+                    <a:stretch>
+                      <a:fillRect/>
+                    </a:stretch>
+                  </pic:blipFill>
+                  <pic:spPr bwMode="auto">
+                    <a:xfrm>
+                      <a:off x="0" y="0"/>
+                      <a:ext cx="3538800" cy="849600"/>
+                    </a:xfrm>
+                    <a:prstGeom prst="rect">
+                      <a:avLst/>
+                    </a:prstGeom>
+                    <a:noFill/>
+                    <a:ln>
+                      <a:noFill/>
+                    </a:ln>
+                  </pic:spPr>
+                </pic:pic>
+              </a:graphicData>
+            </a:graphic>
+            <wp14:sizeRelH relativeFrom="margin">
+              <wp14:pctWidth>0</wp14:pctWidth>
+            </wp14:sizeRelH>
+            <wp14:sizeRelV relativeFrom="margin">
+              <wp14:pctHeight>0</wp14:pctHeight>
+            </wp14:sizeRelV>
+          </wp:anchor>
+        </w:drawing>
       </w:r>
       <w:r>
         <w:rPr>

</xml_diff>